<commit_message>
feat(paper): adecuar articulo en ingles a limite y requisitos GaEE
</commit_message>
<xml_diff>
--- a/paper/articulo-gaee-en.docx
+++ b/paper/articulo-gaee-en.docx
@@ -4,6 +4,68 @@
   <w:body>
     <w:p>
       <w:pPr>
+        <w:jc w:val="center"/>
+      </w:pPr>
+      <w:r>
+        <w:rPr>
+          <w:b/>
+          <w:sz w:val="28"/>
+        </w:rPr>
+        <w:t>A Digital Twin for Blue Carbon Assessment under Hydrological Restoration Scenarios in a Peruvian Mangrove Sanctuary</w:t>
+      </w:r>
+    </w:p>
+    <w:p>
+      <w:pPr>
+        <w:jc w:val="center"/>
+      </w:pPr>
+      <w:r>
+        <w:t>Gian Franco Miguel Gonzalo Samana Ramirez 1, Eduardo Joel Romero Vasquez 2</w:t>
+      </w:r>
+    </w:p>
+    <w:p>
+      <w:pPr>
+        <w:jc w:val="left"/>
+      </w:pPr>
+      <w:r>
+        <w:rPr>
+          <w:sz w:val="18"/>
+        </w:rPr>
+        <w:t>1 Universidad Nacional de Trujillo, Trujillo, Peru</w:t>
+        <w:br/>
+        <w:t>gsamana@unitru.edu.pe</w:t>
+        <w:br/>
+        <w:t>https://orcid.org/0009-0007-7475-2474</w:t>
+      </w:r>
+    </w:p>
+    <w:p>
+      <w:pPr>
+        <w:jc w:val="left"/>
+      </w:pPr>
+      <w:r>
+        <w:rPr>
+          <w:sz w:val="18"/>
+        </w:rPr>
+        <w:t>2 Universidad Nacional de Trujillo, Trujillo, Peru</w:t>
+        <w:br/>
+        <w:t>eromerov@unitru.edu.pe</w:t>
+        <w:br/>
+        <w:t>https://orcid.org/0009-0006-8473-8951</w:t>
+      </w:r>
+    </w:p>
+    <w:p>
+      <w:pPr>
+        <w:jc w:val="left"/>
+      </w:pPr>
+      <w:r>
+        <w:rPr>
+          <w:sz w:val="18"/>
+        </w:rPr>
+        <w:t>CRediT authorship contribution statement — Gian Franco Miguel Gonzalo Samana Ramirez: Conceptualization, Data curation, Formal analysis, Investigation, Methodology, Project administration, Resources, Software, Supervision, Validation, Visualization, Writing – original draft, Writing – review &amp; editing. Eduardo Joel Romero Vasquez: Conceptualization, Data curation, Formal analysis, Investigation, Methodology, Project administration, Resources, Software, Supervision, Validation, Visualization, Writing – original draft, Writing – review &amp; editing.</w:t>
+      </w:r>
+    </w:p>
+    <w:p/>
+    <w:p>
+      <w:pPr>
         <w:pStyle w:val="Heading1"/>
       </w:pPr>
       <w:r>
@@ -87,52 +149,47 @@
     </w:p>
     <w:p>
       <w:r>
-        <w:t>Digital twins emerged in the engineering domain as virtual representations of a physical asset, continuously updated to reflect its current structure and behaviour [1]. Their canonical definition describes them as a virtual representation of a physical asset enabled by data and simulators for prediction, optimisation and real-time monitoring [1], or as a dynamic representation of a real object that mirrors its states and behaviour throughout its life cycle [2]. The distinction between a conventional model and a digital twin is not trivial: it lies in the bidirectional coupling between the physical system and its virtual counterpart, which confers on the latter the capacity for permanent updating [3].</w:t>
+        <w:t>Digital twins emerged in the engineering domain as virtual representations of a physical asset, continuously updated to reflect its current structure and behaviour [1]. Their canonical definition describes them as a virtual representation of a physical asset enabled by data and simulators for prediction, optimisation and real-time monitoring [1], or as a dynamic representation of a real object that mirrors its states and behaviour throughout its life cycle [2]. The distinction from a conventional model is not trivial: it lies in the bidirectional coupling between the physical system and its virtual counterpart, which confers on the latter the capacity for permanent updating [3].</w:t>
       </w:r>
     </w:p>
     <w:p>
       <w:r>
-        <w:t>The application of this paradigm to natural systems is a recent and far-reaching turn. Blair (2021) argues that digital twins of the natural environment represent a singular opportunity, but warns that their construction demands combining the inherited understanding of process-based models with new data-analysis and machine-learning approaches [4]. Ecology has begun to adopt the concept as a form of dynamic fusion between models and data, although inherent limitations persist that should be made explicit so as not to generate exaggerated expectations among modellers, researchers and policy-makers [5].</w:t>
+        <w:t>Applying this paradigm to natural systems is a recent, far-reaching turn. Blair (2021) argues that digital twins of the natural environment represent a singular opportunity, but warns that their construction demands combining the inherited understanding of process-based models with new data-analysis and machine-learning approaches [4]. Ecology has begun to adopt the concept as a dynamic fusion of models and data, although inherent limitations persist that should be made explicit so as not to generate exaggerated expectations among modellers, researchers and policy-makers [5].</w:t>
       </w:r>
     </w:p>
     <w:p>
       <w:r>
-        <w:t>In the realm of aquatic and coastal ecosystems, interest is growing. The Digital Twin Earth initiative has developed emulators based on physics-informed neural operators to predict sea levels in coastal regions, achieving speed-ups of over forty times relative to deterministic numerical models [6]. Tzachor et al. (2023) argue that digital twins may constitute a stepping stone towards ocean sustainability, while warning of the ethical risks and uncertainties associated with the digital representation of marine ecosystem services [7]. Aguzzi et al. (2025) demonstrate that robotic platforms can generate high-resolution data for marine monitoring, but note that challenges remain in achieving adequate spatial coverage, temporal continuity and ecological representativeness [8].</w:t>
+        <w:t>In aquatic and coastal ecosystems, interest is growing. The Digital Twin Earth initiative has developed emulators based on physics-informed neural operators to predict sea levels in coastal regions, achieving speed-ups of over forty times relative to deterministic numerical models [6]. Tzachor et al. (2023) argue that digital twins may constitute a stepping stone towards ocean sustainability, while warning of the ethical risks and uncertainties of digitally representing marine ecosystem services [7]. Aguzzi et al. (2025) demonstrate that robotic platforms can generate high-resolution marine monitoring data, but note persisting challenges in spatial coverage, temporal continuity and ecological representativeness [8].</w:t>
       </w:r>
     </w:p>
     <w:p>
       <w:r>
-        <w:t>Wetlands, and in particular mangrove ecosystems, are an especially pertinent case of application. Lu et al. (2026) explore the concept of wetland digital twins and point out that the state of the ecosystem and its dynamics under future scenarios are essential for stakeholders to carry out proactive management that conserves ecosystems and supports their restoration [9]. Hydrological restoration of coastal wetlands, specifically, has received renewed impetus from blue carbon: Twomey et al. (2024) warn that ecosystem functions and processes influenced by the hydrological regime determine services such as habitat, water quality, carbon capture and coastal protection, but that guidance for hydrological restoration remains limited and is frequently restricted to particular regions or risks [10]. Existing models also face a transferability limitation: their predictive capacities are confined to the specific conditions of the data from which they were built [10].</w:t>
+        <w:t>Wetlands, and mangrove ecosystems in particular, are an especially pertinent case. Lu et al. (2026) explore the concept of wetland digital twins, pointing out that the ecosystem's state and dynamics under future scenarios are essential for proactive management that conserves ecosystems and supports their restoration [9]. Hydrological restoration of coastal wetlands has received renewed impetus from blue carbon: Twomey et al. (2024) warn that hydrologically influenced ecosystem functions determine services such as habitat, water quality, carbon capture and coastal protection, yet guidance for hydrological restoration remains limited and frequently restricted to particular regions or risks [10]. Existing models also face a transferability limitation: their predictive capacities are confined to the specific conditions of the data from which they were built [10].</w:t>
       </w:r>
     </w:p>
     <w:p>
       <w:r>
-        <w:t>Remote sensing and machine learning have substantially expanded the monitoring capacity of these ecosystems. Guo et al. (2017) review research topics in wetland remote sensing —classification, biodiversity, biomass estimation, water quality, mangrove forest and sea-level rise— and document the progress of available techniques [11]. Jafarzadeh et al. (2022), in a meta-analysis of three decades, synthesise best practices for environmental management, restoration and conservation of wetlands based on the combination of remote sensing and machine learning [12]. Systematic biases and gaps persist, however: Meyer et al. (2016) demonstrate that the widespread application of species occurrence information is limited by gaps, uncertainties and biases in the taxonomic, spatial and temporal dimensions [13], and Mollenhauer et al. (2018) show that the geographical representativeness of long-term environmental monitoring infrastructures constitutes a critical gap in the European research landscape [14].</w:t>
+        <w:t>Remote sensing and machine learning have substantially expanded monitoring capacity. Guo et al. (2017) review wetland remote-sensing research —classification, biodiversity, biomass estimation, water quality, mangrove forest, sea-level rise— [11], and Jafarzadeh et al. (2022), in a three-decade meta-analysis, synthesise best practices for wetland management, restoration and conservation from combined remote sensing and machine learning [12]. Systematic biases persist, however: Meyer et al. (2016) show that species occurrence information is limited by gaps, uncertainties and biases in the taxonomic, spatial and temporal dimensions [13], and Mollenhauer et al. (2018) identify the geographical representativeness of long-term monitoring infrastructures as a critical gap in the European research landscape [14]. The associated uncertainty deserves explicit attention: Buffington et al. (2021) incorporate uncertainty into projections of tidal wetland elevation and carbon accumulation, demonstrating that salinity scenarios and productivity functions are determinant for projecting carbon capture [15] — directly relevant to any system aspiring to inform restoration decisions.</w:t>
       </w:r>
     </w:p>
     <w:p>
       <w:r>
-        <w:t>The uncertainty associated with these projections deserves explicit attention. Buffington et al. (2021) incorporate uncertainty into projections of tidal wetland elevation and carbon accumulation under sea-level rise scenarios, demonstrating that both salinity scenarios and productivity functions are determinant for projecting how carbon capture may change [15]. This finding is directly relevant to any system that aspires to inform restoration decisions.</w:t>
+        <w:t>On this basis, the present work addresses three concrete gaps. First, documented ecological digital twins concentrate on marine, urban or agricultural ecosystems, with scarce attention to the mangrove coastal wetlands of the southeastern Pacific. Second, the hydrological restoration literature explicitly recognises the absence of transferable guidance and the dependence of projections on local calibration conditions [10]. Third, existing implementations rarely make explicit the separation between the empirical and simulated portions of their data, hindering audit of the basis of their results.</w:t>
       </w:r>
     </w:p>
     <w:p>
       <w:r>
-        <w:t>On the basis of these antecedents, the present work addresses three concrete gaps. First, documented ecological digital twins concentrate on marine, urban or agricultural ecosystems, with scarce attention to the mangrove coastal wetlands of the southeastern Pacific. Second, the literature on hydrological restoration of coastal wetlands explicitly recognises the absence of transferable guidance and the dependence of projections on local calibration conditions [10]. Third, existing implementations rarely make explicit the separation between the empirical and the simulated portions of their data, which makes it difficult to audit the basis of their results.</w:t>
+        <w:t>To address them, a digital twin of the Los Manglares de Tumbes National Sanctuary (SNLMT), in northern Peru, was built, applying the CRISP-DM methodology to structure the analytical process into six traceable phases: business understanding, data understanding, preparation, modelling, evaluation and deployment [16]. The working hypothesis postulates that hydrological restoration can increase blue carbon retention by at least 25 % by 2050 relative to baseline.</w:t>
       </w:r>
     </w:p>
     <w:p>
       <w:r>
-        <w:t>To address them, a digital twin of the Los Manglares de Tumbes National Sanctuary (SNLMT), in northern Peru, was built, and the CRISP-DM methodology was applied to structure the analytical process into six traceable phases: business understanding, data understanding, preparation, modelling, evaluation and deployment [16]. The working hypothesis postulates that hydrological restoration can increase blue carbon retention by at least 25 % by 2050 relative to the baseline.</w:t>
+        <w:t>The contribution is threefold. First, a hybrid dataset with explicit traceability of its real and simulated components is documented, anchored in open literature on the SNLMT. Second, five algorithms are compared under an evaluation protocol combining cross-validation, statistical significance testing and bootstrap resampling, following established practice for rigorous model comparison [5]. Third, an interactive dashboard is delivered that exposes interpretability as a first-class capability, heeding the recommendation to centre environmental digital twin development on outcomes meaningful to users rather than isolated technical capabilities [17].</w:t>
       </w:r>
     </w:p>
     <w:p>
       <w:r>
-        <w:t>The contribution of the work is threefold. First, a hybrid dataset with explicit traceability of its real and simulated components is documented, anchored in open literature on the SNLMT. Second, five algorithms are compared under an evaluation protocol combining cross-validation, statistical significance testing and bootstrap resampling, following the established practice for rigorous model comparison [5]. Third, an interactive dashboard is delivered that exposes interpretability as a first-class capability, heeding the recommendation to centre the development of environmental digital twins on outcomes meaningful to users rather than on isolated technical capabilities [17].</w:t>
-      </w:r>
-    </w:p>
-    <w:p>
-      <w:r>
-        <w:t>Development was sustained on a distributed version control repository that accumulated 39 commits between 31 August and 29 September 2026. This versioning discipline is not an instrumental detail: every quality review finding, every correction and every feature addition was recorded with a descriptive message that allows the evolution of the system to be reconstructed and the origin of any design decision to be audited. Issue planning on a tracking platform was projected as a complement, although its full implementation exceeded the time scope of the deliverable.</w:t>
+        <w:t>Development was sustained on a distributed version control repository accumulating 39 commits between 31 August and 29 September 2026. This versioning discipline is not an instrumental detail: every quality review finding, correction and feature addition was recorded with a descriptive message allowing the system's evolution to be reconstructed and the origin of any design decision to be audited. Issue planning on a tracking platform was projected as a complement, although its full implementation exceeded the deliverable's time scope.</w:t>
       </w:r>
     </w:p>
     <w:p>
@@ -158,12 +215,7 @@
     </w:p>
     <w:p>
       <w:r>
-        <w:t>Rasheed et al. (2020), after reviewing the literature, propose an operative definition: a digital twin is a virtual representation of a physical asset enabled by data and simulators for prediction, optimisation and real-time monitoring [1]. Verdouw et al. (2021) emphasise the temporal dimension by describing it as a dynamic representation of a real object that mirrors its states and behaviour throughout its life cycle [2]. Both formulations converge on three constitutive elements: a physical counterpart, a computational model and a data flow that keeps them synchronised.</w:t>
-      </w:r>
-    </w:p>
-    <w:p>
-      <w:r>
-        <w:t>Durão et al. (2018) systematise the requirements that the literature imposes on the concept, establishing that its industrial adoption depends on the capacity to represent not only the geometry and structure of the asset, but also its operative behaviour under changing conditions [18]. This requirement translates directly to the environmental domain: a digital twin of an ecosystem must represent its dynamics, not merely its state.</w:t>
+        <w:t>Rasheed et al. (2020) propose an operative definition: a digital twin is a virtual representation of a physical asset enabled by data and simulators for prediction, optimisation and real-time monitoring [1]; Verdouw et al. (2021) emphasise the temporal dimension, describing it as a dynamic representation mirroring states and behaviour throughout the object's life cycle [2]. Both formulations converge on three constitutive elements: a physical counterpart, a computational model and a data flow keeping them synchronised. Durão et al. (2018) systematise the requirements the literature imposes on the concept — representing not only the asset's geometry and structure but also its operative behaviour under changing conditions [18] — which translates directly to the environmental domain: a digital twin of an ecosystem must represent its dynamics, not merely its state.</w:t>
       </w:r>
     </w:p>
     <w:p>
@@ -176,22 +228,12 @@
     </w:p>
     <w:p>
       <w:r>
-        <w:t>Building digital twins at ecosystem scale requires architectures capable of integrating heterogeneous sources. Nativi et al. (2021) describe the digital ecosystem developed within the Destination Earth initiative, and argue that a comprehensive discussion of the multiple dimensions and challenges of digital ecosystems fills an important gap in current knowledge [19].</w:t>
+        <w:t>Ecosystem-scale digital twins require architectures integrating heterogeneous sources. Nativi et al. (2021) describe the Destination Earth digital ecosystem [19]; Picone et al. (2023) propose modular edge twins to reduce latency [20]; and Raes et al. (2022) present DUET, an interoperable smart-city framework [21].</w:t>
       </w:r>
     </w:p>
     <w:p>
       <w:r>
-        <w:t>In the technical implementation domain, Picone et al. (2023) propose a flexible and modular architecture for edge digital twins, oriented towards reducing latency through local data processing [20]. Raes et al. (2022) present the DUET framework, aimed at building interoperable and trustworthy digital twins for smart cities, addressing the need for systems developed by different actors to exchange information [21]. Interoperability, they note, is a condition for avoiding fragmentation into data silos.</w:t>
-      </w:r>
-    </w:p>
-    <w:p>
-      <w:r>
-        <w:t>Chen et al. (2025) address the problem of federated digital twin construction via distributed sensing, proposing an online optimisation scheme based on game theory. They warn, however, that the number of sensors associated with each entity is limited and that the accumulated cost is constrained by that restriction [22]. This observation is relevant to any environmental deployment, where instrumentation resources are inherently bounded.</w:t>
-      </w:r>
-    </w:p>
-    <w:p>
-      <w:r>
-        <w:t>At ecosystem scale, Khan et al. (2025) propose TwinEco, a unified framework for dynamic data-driven digital twins in ecology, with design principles applicable to urban, agricultural and natural ecosystems [23]. Qamsane et al. (2021) contribute a structured methodology for developing and implementing digital twin solutions, with explicit phases of scope definition, modelling and validation [16]. This methodological structure parallels the CRISP-DM approach adopted in the present work.</w:t>
+        <w:t>Chen et al. (2025) propose game-theoretic optimisation for federated twins, noting sensor-number and cost constraints relevant to resource-limited environmental deployments [22]. Khan et al. (2025) propose TwinEco for ecological digital twins [23], while Qamsane et al. (2021) define scope, modelling and validation phases [16], paralleling CRISP-DM.</w:t>
       </w:r>
     </w:p>
     <w:p>
@@ -204,17 +246,12 @@
     </w:p>
     <w:p>
       <w:r>
-        <w:t>The tension between physical fidelity and computational cost defines much of the research in this field. Jiang et al. (2021) developed the first digital twin of the Earth's coasts, employing physics-informed neural operators as surrogates for deterministic coastal flood models. Their emulator predicts sea surface height accurately and achieves speed-ups of up to forty-five times relative to the reference numerical model, enabling the efficient execution of multiple scenarios for decision-making and uncertainty quantification [6].</w:t>
+        <w:t>A central challenge is balancing physical fidelity and computational cost. Jiang et al. (2021) used physics-informed neural operators to emulate coastal flood models, achieving up to 45-fold speed-ups while predicting sea-surface height accurately [6].</w:t>
       </w:r>
     </w:p>
     <w:p>
       <w:r>
-        <w:t>Yang et al. (2024) examine physics-informed neural networks from the digital twin perspective, and note that many approaches restrict their scope to the use of sparse guide data —between one and ten percent of the mesh points—, which constitutes an inefficient exploitation of available simulation results [24]. Zia et al. (2025) propose the incorporation of physics-encoded blocks into residual network architectures, and warn that operational datasets commonly present missing values originating from power cuts, sensor failures or adverse weather conditions [25]. Dilip (2024) applies the same principle to asphalt pavements, building a thermal digital twin via physics-informed neural networks [26].</w:t>
-      </w:r>
-    </w:p>
-    <w:p>
-      <w:r>
-        <w:t>Reichstein et al. (2019) frame this convergence in a broader context: deep learning and process understanding must be integrated for the advancement of data-driven Earth system science, overcoming the opposition between purely statistical and purely mechanistic approaches [27].</w:t>
+        <w:t>Yang et al. (2024) note that physics-informed approaches often use only 1–10 % of available simulation points [24]. Zia et al. (2025) propose physics-encoded residual blocks and note missing operational data from power and sensor failures or adverse weather [25]; Dilip (2024) applies physics-informed networks to asphalt pavements [26]. More broadly, Reichstein et al. (2019) call for integrating deep learning and process understanding in Earth-system science [27].</w:t>
       </w:r>
     </w:p>
     <w:p>
@@ -227,17 +264,17 @@
     </w:p>
     <w:p>
       <w:r>
-        <w:t>The quality of a digital twin is bounded by the quality of its data. Guo et al. (2017) review wetland remote sensing and document that aerial photography offers advantages in spatial resolution and acquisition time, although its use is usually restricted to narrow coastal areas or riverbanks due to limited coverage [11]. Jafarzadeh et al. (2022), through a meta-analysis of three decades, synthesise established practices for wetland monitoring and highlight that the findings are essential for determining best practices in environmental management, restoration and conservation [12].</w:t>
+        <w:t>Digital-twin quality is bounded by data quality. Guo et al. (2017) review wetland remote sensing, including aerial photography’s resolution advantages and coverage limits [11]; Jafarzadeh et al. (2022) synthesise three decades of wetland-monitoring practices [12].</w:t>
       </w:r>
     </w:p>
     <w:p>
       <w:r>
-        <w:t>Biases in ecological data constitute a structural limitation. Meyer et al. (2015) establish global priorities for an effective information basis of biodiversity distributions [28], and Meyer et al. (2016) demonstrate that the widespread application of occurrence information is limited by gaps, uncertainties and biases in the taxonomic, spatial and temporal dimensions [13]. Mollenhauer et al. (2018) evaluate the geographical representativeness of long-term environmental monitoring infrastructures in Europe and conclude that a critical gap persists in the research infrastructure landscape [14]. Jeffery et al. (2021) extend the warning to the plane of data infrastructures, arguing that convergence between repositories and systems is not yet resolved [29].</w:t>
+        <w:t>Ecological data have structural biases. Meyer et al. (2015) set global priorities for biodiversity-distribution information [28]; Meyer et al. (2016) identify taxonomic, spatial and temporal gaps in occurrence data [13]. Mollenhauer et al. (2018) find geographical gaps in European long-term monitoring [14], while Jeffery et al. (2021) note that data-infrastructure convergence remains unresolved [29].</w:t>
       </w:r>
     </w:p>
     <w:p>
       <w:r>
-        <w:t>Uncertainty must therefore be propagated explicitly. Buffington et al. (2021) incorporate uncertainty into projections of tidal wetland elevation and carbon accumulation under sea-level rise scenarios, and demonstrate that both salinity scenarios and productivity functions are determinant in projecting how carbon capture may change [15]. Cabrera et al. (2021), when evaluating the potential of smartphones as urban weather stations, warn that their results represent the behaviour of a single device model, which illustrates the need to bound the scope of conclusions to the effectively observed domain [30].</w:t>
+        <w:t>Uncertainty must be propagated explicitly. Buffington et al. (2021) show salinity scenarios and productivity functions determine carbon projections under sea-level rise [15]. Cabrera et al. (2021) caution that smartphone-weather results from one device model cannot be generalised beyond the observed domain [30].</w:t>
       </w:r>
     </w:p>
     <w:p>
@@ -250,27 +287,17 @@
     </w:p>
     <w:p>
       <w:r>
-        <w:t>The recent literature insists that the value of an environmental digital twin is decided by its usefulness for decision-making, not by its technical sophistication. Durden (2025) identifies four main challenges that condition the generation of products meaningful to user needs and argues that the development of use cases must focus explicitly on those outcomes [17]. The author further notes that, although decision-makers are the most evident users, the incorporation of other stakeholders broadens the capacity for collaborative decision-making and communication [17].</w:t>
+        <w:t>The recent literature insists that the value of an environmental digital twin is decided by its usefulness for decision-making, not its technical sophistication. Durden (2025) identifies four challenges conditioning the generation of products meaningful to user needs, arguing that use-case development must focus explicitly on those outcomes and that incorporating stakeholders beyond decision-makers broadens collaborative capacity [17]. Data may also come from non-professional sources: Brown and Williams (2019) argue that confirmatory hypothesis testing is entirely possible with large-scale internet-based citizen science projects designed for that purpose, though such projects remain scarce [31].</w:t>
       </w:r>
     </w:p>
     <w:p>
       <w:r>
-        <w:t>The quality of the data available for these systems depends in part on non-professional sources. Brown and Williams (2019) argue that hypothesis testing in the confirmatory paradigm is entirely possible with large-scale internet-based citizen science projects, provided they are specifically designed for that purpose, although they note that such projects are scarce [31]. This observation broadens the universe of data potentially integrable into an ecological digital twin, while warning of the requirement for deliberate methodological design for such observations to be usable.</w:t>
+        <w:t>De Koning et al. (2023) warn that adopting the concept in ecology must be accompanied by a frank discussion of its inherent limitations, to avoid expectations that mislead modellers, researchers and policy-makers [5]; Tzachor et al. (2023) extend that warning to the oceanic domain [7]. Governance work examines where urban digital twins are effective [32], proposes frameworks for aligning standards [33], and addresses privacy and data sovereignty [34] and the role of data governance in the sustainable transition [35].</w:t>
       </w:r>
     </w:p>
     <w:p>
       <w:r>
-        <w:t>De Koning et al. (2023) warn that the adoption of the concept in ecology must be accompanied by a frank discussion of its inherent limitations, to avoid expectations that may mislead modellers, researchers, policy-makers and natural resource managers [5]. Tzachor et al. (2023) extend that warning to the oceanic domain, anticipating ethical concerns and uncertainties in the digital representation of marine ecosystem services [7].</w:t>
-      </w:r>
-    </w:p>
-    <w:p>
-      <w:r>
-        <w:t>In the governance domain, Haraguchi et al. (2024) examine both the benefits and limitations of urban digital twins, exploring the specific areas where their impact is effective and those where it is bounded [32]. Hananto and Veza (2025) propose a governance framework for intelligent digital twin systems oriented towards aligning standards and practices [33], while DeVries (2024) addresses the privacy and data sovereignty challenges that emerge from integrating these technologies into urban ecosystems [34]. Garske et al. (2024) analyse the role of European data governance in the sustainable transition [35].</w:t>
-      </w:r>
-    </w:p>
-    <w:p>
-      <w:r>
-        <w:t>Specific applications illustrate the range of the paradigm. Henriksen et al. (2023) develop a digital twin for climate change adaptation, water management and disaster risk reduction, noting that the depth of the water table is the determining variable of carbon emissions in peat soils, and that knowledge of hydrological variability is decisive for guiding the restoration of drained peatlands [36]. Rodríguez-Alonso et al. (2024) present a digital twin platform for water treatment plants based on a microservices architecture, oriented towards optimising operation and maintenance through machine learning and simulation [37]. Alenezi and Alabaiadly (2026) review the application of digital twins and edge computing to small off-grid water systems [38]. Verdouw et al. (2021) document their adoption in smart farming, noting that studies in that domain are relatively scarce compared with other sectors [2].</w:t>
+        <w:t>Applications include climate-adaptation and water-management twins, where water-table depth determines peat-soil carbon emissions and hydrological variability guides restoration [36]; microservices platforms for water treatment [37]; edge twins for off-grid water systems [38]; and smart-farming deployments, still relatively scarce [2].</w:t>
       </w:r>
     </w:p>
     <w:p>
@@ -283,17 +310,12 @@
     </w:p>
     <w:p>
       <w:r>
-        <w:t>Coastal wetlands constitute a case of application with its own characteristics. Twomey et al. (2024) argue that restoration oriented towards blue carbon provides renewed impetus to the recovery of hydrologically modified coastal plains, but warn that guidance for hydrological restoration remains limited and is frequently focused on particular regions, activities or risks [10]. They further stress that ecosystem functions and processes influenced by the hydrological regime determine services such as habitat provision, water quality improvement, carbon capture and coastal protection [10].</w:t>
+        <w:t>Twomey et al. (2024) argue that blue-carbon-oriented restoration renews the impetus for recovering hydrologically modified coastal plains, but warn that guidance remains limited and frequently focused on particular regions or risks [10]. They stress that hydrologically influenced ecosystem functions determine services such as habitat provision, water quality, carbon capture and coastal protection; that models may not be transferable across sites, with predictive capacity restricted to the construction data's conditions; and that elevation-data uncertainty and soil surface change are key limitations for projecting restoration-site impacts [10].</w:t>
       </w:r>
     </w:p>
     <w:p>
       <w:r>
-        <w:t>The transferability of models is an explicitly recognised limitation. Twomey et al. (2024) note that models may not be transferable to other sites and that their predictive capacity is restricted to the specific conditions of the data used in their construction [10]. In relation to sea-level rise, they identify that uncertainty in elevation data and in soil surface changes over time are key limitations for many models, despite being determining parameters for projecting impacts on restoration sites [10].</w:t>
-      </w:r>
-    </w:p>
-    <w:p>
-      <w:r>
-        <w:t>Lu et al. (2026) explore specifically the concept of wetland digital twins for ecosystem monitoring and management, noting that the state and dynamics of the ecosystem under future scenarios are essential for stakeholders to carry out proactive management oriented towards conserving the ecosystem and supporting its restoration [9]. They also observe that wetlands have suffered significant losses and degradation at a global scale over the last centuries due to human disturbances and climate change [9].</w:t>
+        <w:t>Lu et al. (2026) explore specifically the concept of wetland digital twins for monitoring and management, noting that the ecosystem's state and dynamics under future scenarios are essential for proactive stakeholder management, and that wetlands have suffered significant global losses and degradation over the last centuries [9].</w:t>
       </w:r>
     </w:p>
     <w:p>
@@ -315,12 +337,7 @@
         <w:t>Cross-Industry Standard Process for Data Mining</w:t>
       </w:r>
       <w:r>
-        <w:t>— organises an analytical project into six iterative phases: business understanding, data understanding, preparation, modelling, evaluation and deployment. Unlike approaches centred exclusively on the algorithm, the standard demands that every analytical artefact be traceable to an explicit business objective and that evaluation contemplate success criteria defined beforehand.</w:t>
-      </w:r>
-    </w:p>
-    <w:p>
-      <w:r>
-        <w:t>The methodology parallels the structured frameworks proposed for digital twin development. Qamsane et al. (2021) establish explicit phases of scope definition, modelling and validation in their implementation methodology [16], and Durden (2025) insists that use-case development must start from user needs and not from available technical capabilities [17]. The present work adopts the CRISP-DM framework and documents each phase with its verifiable products.</w:t>
+        <w:t>— organises an analytical project into six iterative phases: business understanding, data understanding, preparation, modelling, evaluation and deployment. Unlike algorithm-centred approaches, the standard demands that every analytical artefact be traceable to an explicit business objective with success criteria defined beforehand — a structure paralleling the frameworks proposed for digital twin development [16] and the insistence that use cases start from user needs rather than available technical capabilities [17]. The present work adopts the framework and documents each phase with verifiable products.</w:t>
       </w:r>
     </w:p>
     <w:p>
@@ -898,7 +915,7 @@
     </w:tbl>
     <w:p>
       <w:r>
-        <w:t xml:space="preserve">The structure of the plant community is characterised by the Importance Value Index (IVI), which integrates relative density, frequency and dominance. </w:t>
+        <w:t xml:space="preserve">The plant community structure is characterised by the Importance Value Index (IVI), which integrates relative density, frequency and dominance. </w:t>
       </w:r>
       <w:r>
         <w:rPr>
@@ -1221,7 +1238,7 @@
         <w:drawing>
           <wp:inline xmlns:a="http://schemas.openxmlformats.org/drawingml/2006/main" xmlns:pic="http://schemas.openxmlformats.org/drawingml/2006/picture">
             <wp:extent cx="5580000" cy="3469091"/>
-            <wp:docPr id="1" name="Picture 1"/>
+            <wp:docPr id="1" name="Picture 1" descr="Evolution of mangrove extent of the SNLMT between 1996 and 2020. Real data from Global Mangrove Watch v3.0. The sustained positive trend is consistent with the protected natural area status of the Sanctuary."/>
             <wp:cNvGraphicFramePr>
               <a:graphicFrameLocks noChangeAspect="1"/>
             </wp:cNvGraphicFramePr>
@@ -1274,7 +1291,7 @@
     </w:p>
     <w:p>
       <w:r>
-        <w:t xml:space="preserve">The dataset employed is hybrid in nature and explicit in its traceability. The </w:t>
+        <w:t xml:space="preserve">The dataset is hybrid in nature and explicit in its traceability. The </w:t>
       </w:r>
       <w:r>
         <w:rPr>
@@ -1297,7 +1314,7 @@
     </w:p>
     <w:p>
       <w:r>
-        <w:t>The explicit separation between the real and simulated components responds to a methodological criterion: it allows auditing which part of the result rests on empirical evidence and which part on the physical model's projection. The engine implements a saturating response curve to restoration —consistent with the law of diminishing returns observed in restored wetlands [10]— and a progressive loss of area and density associated with three sea-level rise scenarios aligned with IPCC ranges [15].</w:t>
+        <w:t>The explicit separation between the real and simulated components responds to a methodological criterion: it allows auditing which part of the result rests on empirical evidence and which part on the physical model's projection. The engine implements a saturating response curve to restoration —consistent with the diminishing returns observed in restored wetlands [10]— and a progressive loss of area and density associated with three sea-level rise scenarios aligned with IPCC ranges [15].</w:t>
       </w:r>
     </w:p>
     <w:p>
@@ -1315,7 +1332,7 @@
     </w:p>
     <w:p>
       <w:r>
-        <w:t>The system implements the six phases of the standard as independent, verifiable modules.</w:t>
+        <w:t>The system implements the standard’s six phases as verifiable modules.</w:t>
       </w:r>
     </w:p>
     <w:p>
@@ -1328,7 +1345,7 @@
     </w:p>
     <w:p>
       <w:r>
-        <w:t xml:space="preserve">An explicit business objective and analytical objective were defined, together with verifiable success criteria established </w:t>
+        <w:t xml:space="preserve">Business and analytical objectives were defined with </w:t>
       </w:r>
       <w:r>
         <w:rPr>
@@ -1337,7 +1354,7 @@
         <w:t>a priori</w:t>
       </w:r>
       <w:r>
-        <w:t>: out-of-sample coefficient of determination greater than or equal to 0.85; mean absolute error less than or equal to 3 percentage points; statistically significant difference from the reference linear model; and stability across partitions with a standard deviation of R² not exceeding 0.05.</w:t>
+        <w:t xml:space="preserve"> success criteria: out-of-sample R² ≥ 0.85; MAE ≤ 3 percentage points; significant difference from the linear baseline; and cross-partition R² standard deviation ≤ 0.05.</w:t>
       </w:r>
     </w:p>
     <w:p>
@@ -2555,7 +2572,7 @@
         <w:t>Figure 2</w:t>
       </w:r>
       <w:r>
-        <w:t xml:space="preserve"> presents the distribution of the main variables. The concentration of observations at the extremes of the restoration range responds to the experimental design described; the NDVI shows reduced dispersion due to its restriction to the observed range of the mid-band mangrove.</w:t>
+        <w:t xml:space="preserve"> presents the distribution of the main variables. The concentration of observations at the extremes of the restoration range responds to the experimental design; the NDVI shows reduced dispersion due to its restriction to the observed range of the mid-band mangrove.</w:t>
       </w:r>
     </w:p>
     <w:p>
@@ -2566,7 +2583,7 @@
         <w:drawing>
           <wp:inline xmlns:a="http://schemas.openxmlformats.org/drawingml/2006/main" xmlns:pic="http://schemas.openxmlformats.org/drawingml/2006/picture">
             <wp:extent cx="5580000" cy="3551268"/>
-            <wp:docPr id="2" name="Picture 2"/>
+            <wp:docPr id="2" name="Picture 2" descr="Distribution of the main variables of the hybrid dataset. The maxima at the extremes of the restoration range are intentional and prevent bias of tree ensembles at the edges of the domain."/>
             <wp:cNvGraphicFramePr>
               <a:graphicFrameLocks noChangeAspect="1"/>
             </wp:cNvGraphicFramePr>
@@ -2628,7 +2645,7 @@
         <w:t>within</w:t>
       </w:r>
       <w:r>
-        <w:t xml:space="preserve"> each modelling pipeline, so that normalisation parameters are estimated exclusively on each training partition and do not contaminate the evaluation. This design prevents information leakage, a frequent error when scaling is executed on the complete set before partitioning.</w:t>
+        <w:t xml:space="preserve"> each modelling pipeline, so that normalisation parameters are estimated exclusively on each training partition and do not contaminate the evaluation — a design that prevents information leakage, a frequent error when scaling is executed on the complete set before partitioning.</w:t>
       </w:r>
     </w:p>
     <w:p>
@@ -2663,7 +2680,7 @@
         <w:t>cross-validation</w:t>
       </w:r>
       <w:r>
-        <w:t xml:space="preserve"> with ten folds, employing the mean R² across folds as the principal selection criterion for being more robust than a single test partition. Second, </w:t>
+        <w:t xml:space="preserve"> with ten folds, employing the mean R² across folds as the principal selection criterion. Second, </w:t>
       </w:r>
       <w:r>
         <w:rPr>
@@ -2701,7 +2718,7 @@
         <w:t>Interpretability</w:t>
       </w:r>
       <w:r>
-        <w:t xml:space="preserve"> was addressed through permutation importance, a model-agnostic technique that quantifies the drop in R² when each variable is randomly shuffled, with ten repetitions to estimate its variability [1], [40]. This choice allows auditing the model without depending on assumptions about its internal structure.</w:t>
+        <w:t xml:space="preserve"> was addressed through permutation importance, a model-agnostic technique quantifying the drop in R² when each variable is randomly shuffled, with ten repetitions to estimate variability [1], [40]. This choice allows auditing the model without depending on assumptions about its internal structure.</w:t>
       </w:r>
     </w:p>
     <w:p>
@@ -2714,7 +2731,7 @@
     </w:p>
     <w:p>
       <w:r>
-        <w:t xml:space="preserve">The deployment phase materialised in two products. The first is an </w:t>
+        <w:t xml:space="preserve">Deployment materialised in two products. The first is an </w:t>
       </w:r>
       <w:r>
         <w:rPr>
@@ -2745,12 +2762,7 @@
     </w:p>
     <w:p>
       <w:r>
-        <w:t>Development was managed on Git with a linear history on the main branch, accumulating 39 commits between 31 August and 29 September 2026. The message convention followed the conventional commits format, with prefixes identifying the type of change and references to the quality review findings addressed. This practice made it possible to reconstruct the origin of each design decision and to sustain a continuous review process over the code.</w:t>
-      </w:r>
-    </w:p>
-    <w:p>
-      <w:r>
-        <w:t>Issue management was planned on a project tracking platform with a task board, user stories and acceptance criteria per increment. Its full implementation fell outside the time scope of the present deliverable, but the structure of the commit messages preserves the relationship between each change and the finding or requirement that motivated it.</w:t>
+        <w:t>Development was managed on Git with a linear history on the main branch, accumulating 39 commits between 31 August and 29 September 2026. The message convention followed the conventional commits format, with prefixes identifying the type of change and references to the quality review findings addressed — a practice that made it possible to reconstruct the origin of each design decision and sustain continuous review. Issue management was planned on a tracking platform with a task board, user stories and acceptance criteria; its full implementation fell outside the deliverable's time scope, but the commit-message structure preserves the link between each change and its motivating finding or requirement.</w:t>
       </w:r>
     </w:p>
     <w:p>
@@ -2763,7 +2775,7 @@
     </w:p>
     <w:p>
       <w:r>
-        <w:t>The code is organised into single-responsibility modules: hybrid dataset generation, CRISP-DM engine, interactive application and document assembler. All figures in the article are derived automatically from the engine; none is transcribed manually. The random seed is fixed (42) and dependency versions are pinned in the requirements file, so that repeated execution reproduces exactly the reported results.</w:t>
+        <w:t>The code is organised into modules for hybrid dataset generation, CRISP-DM, the interactive application and document assembly. Article figures derive automatically from the engine. A fixed random seed (42) and pinned dependencies ensure reproducibility.</w:t>
       </w:r>
     </w:p>
     <w:p>
@@ -3261,7 +3273,7 @@
         <w:drawing>
           <wp:inline xmlns:a="http://schemas.openxmlformats.org/drawingml/2006/main" xmlns:pic="http://schemas.openxmlformats.org/drawingml/2006/picture">
             <wp:extent cx="5580000" cy="2737931"/>
-            <wp:docPr id="3" name="Picture 3"/>
+            <wp:docPr id="3" name="Picture 3" descr="Comparison of the coefficient of determination on the test set and in cross-validation for the five evaluated models. The proximity between both bars in each model indicates absence of overfitting."/>
             <wp:cNvGraphicFramePr>
               <a:graphicFrameLocks noChangeAspect="1"/>
             </wp:cNvGraphicFramePr>
@@ -3323,7 +3335,7 @@
         <w:drawing>
           <wp:inline xmlns:a="http://schemas.openxmlformats.org/drawingml/2006/main" xmlns:pic="http://schemas.openxmlformats.org/drawingml/2006/picture">
             <wp:extent cx="5580000" cy="5155947"/>
-            <wp:docPr id="4" name="Picture 4"/>
+            <wp:docPr id="4" name="Picture 4" descr="Predicted versus observed values for the Extra Trees model. The absence of curvature or heteroscedasticity indicates that the ensemble reproduces the engine's response surface without directional bias."/>
             <wp:cNvGraphicFramePr>
               <a:graphicFrameLocks noChangeAspect="1"/>
             </wp:cNvGraphicFramePr>
@@ -3760,22 +3772,17 @@
         <w:t>Gradient Boosting</w:t>
       </w:r>
       <w:r>
-        <w:t xml:space="preserve"> values of 5.23 and 7.49 respectively. It is important to note that the Wilcoxon test, operating on only ten folds, presents the maximum possible granularity (p = 0.0625), an intrinsic limitation of the fold sample size and not evidence of absence of effect.</w:t>
+        <w:t xml:space="preserve"> values of 5.23 and 7.49 respectively. The Wilcoxon test, operating on only ten folds, presents the maximum possible granularity (p = 0.0625), an intrinsic limitation of the fold sample size and not evidence of absence of effect.</w:t>
       </w:r>
     </w:p>
     <w:p>
       <w:r>
-        <w:t>The 95 % confidence interval for the mean absolute error, obtained by bootstrap resampling with 500 replicates, was [0.012; 0.016] percentage points, with a mean of 0.014. The narrowness of the interval confirms the stability of performance across resamples.</w:t>
+        <w:t>The 95 % confidence interval for the mean absolute error, obtained by bootstrap resampling with 500 replicates, was [0.012; 0.016] percentage points, with a mean of 0.014.</w:t>
       </w:r>
     </w:p>
     <w:p>
       <w:r>
-        <w:t>The Shapiro-Wilk test on the residuals was significant (W = 0.768; p &lt; 0.001), indicating that the errors do not follow a normal distribution. This finding justifies the inclusion of the non-parametric Wilcoxon test as a complementary contrast and reinforces the robustness of the conclusion: despite the non-normality, both tests converge on the superiority of the ensemble.</w:t>
-      </w:r>
-    </w:p>
-    <w:p>
-      <w:r>
-        <w:t>The magnitude of that non-normality deserves precision. Given that the residuals present a distribution with markedly concentrated tails —with most errors close to zero—, the deviation from normality reflects a precision superior to what the parametric assumption would anticipate, not a defect of the model. This pattern is characteristic of emulators over deterministic models, where the response surface lacks the random noise that usually produces Gaussian residuals.</w:t>
+        <w:t>The Shapiro-Wilk test on the residuals was significant (W = 0.768; p &lt; 0.001), indicating that the errors do not follow a normal distribution. Both tests therefore converge on the ensemble’s superiority despite non-normality. Given that the residuals present markedly concentrated tails —most errors close to zero—, the deviation from normality reflects a precision superior to what the parametric assumption would anticipate, not a defect of the model; this pattern is characteristic of emulators over deterministic models, whose response surface lacks the random noise that usually produces Gaussian residuals.</w:t>
       </w:r>
     </w:p>
     <w:p>
@@ -4073,7 +4080,7 @@
         <w:drawing>
           <wp:inline xmlns:a="http://schemas.openxmlformats.org/drawingml/2006/main" xmlns:pic="http://schemas.openxmlformats.org/drawingml/2006/picture">
             <wp:extent cx="5580000" cy="3489558"/>
-            <wp:docPr id="5" name="Picture 5"/>
+            <wp:docPr id="5" name="Picture 5" descr="Permutation importance of the variables of the Extra Trees model, with error bars corresponding to ten repetitions."/>
             <wp:cNvGraphicFramePr>
               <a:graphicFrameLocks noChangeAspect="1"/>
             </wp:cNvGraphicFramePr>
@@ -4118,12 +4125,7 @@
     </w:p>
     <w:p>
       <w:r>
-        <w:t>The sea-level rise scenario led the contribution (mean importance = 1.071), followed by the hydrological restoration level (0.839). Both variables exhibited small standard deviations (0.053 and 0.046), which indicates stability of the estimation. The time-horizon, baseline-area, carbon-density and NDVI variables presented importance indistinguishable from zero.</w:t>
-      </w:r>
-    </w:p>
-    <w:p>
-      <w:r>
-        <w:t>This result is substantively relevant and not an artefact. In the engine's formulation, the percentage variation depends exclusively on the restoration level and the sea-level scenario, while the baseline area and density determine the absolute carbon but cancel out in the percentage ratio. The coherence between the empirical importance and the structure of the physical model constitutes an indirect validation of the attribution procedure.</w:t>
+        <w:t>The sea-level rise scenario led the contribution (mean importance = 1.071), followed by the hydrological restoration level (0.839); both exhibited small standard deviations (0.053 and 0.046), indicating stability of the estimation. The time-horizon, baseline-area, carbon-density and NDVI variables presented importance indistinguishable from zero. This is substantively relevant and not an artefact: in the engine's formulation, the percentage variation depends exclusively on the restoration level and the sea-level scenario, while baseline area and density determine the absolute carbon but cancel out in the percentage ratio. This coherence indirectly validates the attribution procedure.</w:t>
       </w:r>
     </w:p>
     <w:p>
@@ -4158,7 +4160,7 @@
         <w:drawing>
           <wp:inline xmlns:a="http://schemas.openxmlformats.org/drawingml/2006/main" xmlns:pic="http://schemas.openxmlformats.org/drawingml/2006/picture">
             <wp:extent cx="5580000" cy="3465703"/>
-            <wp:docPr id="6" name="Picture 6"/>
+            <wp:docPr id="6" name="Picture 6" descr="Mean variation of retained carbon by hydrological restoration band, contrasted with the +25 % hypothesis threshold. The monotonically increasing relationship indicates diminishing but sustained returns."/>
             <wp:cNvGraphicFramePr>
               <a:graphicFrameLocks noChangeAspect="1"/>
             </wp:cNvGraphicFramePr>
@@ -4203,7 +4205,7 @@
     </w:p>
     <w:p>
       <w:r>
-        <w:t>The results show a monotonically increasing relationship between restoration level and carbon variation. In the low-restoration band (0–25 %), the mean variation was −17.64 %, with a net loss of carbon. In the mid-low band (25–50 %) practical equilibrium was reached (−1.92 %). The mid-high band (50–75 %) recorded a mean gain of 5.79 %, with 17.06 % of scenarios exceeding the threshold. The high band (75–100 %) reached a mean gain of 11.24 %, with 34.85 % of scenarios exceeding the +25 % threshold.</w:t>
+        <w:t>The results show a monotonically increasing relationship between restoration level and carbon variation. In the low band (0–25 %), the mean variation was −17.64 %, with a net loss of carbon. In the mid-low band (25–50 %) practical equilibrium was reached (−1.92 %). The mid-high band (50–75 %) recorded a mean gain of 5.79 %, with 17.06 % of scenarios exceeding the threshold. The high band (75–100 %) reached a mean gain of 11.24 %, with 34.85 % of scenarios exceeding the +25 % threshold.</w:t>
       </w:r>
     </w:p>
     <w:p>
@@ -4214,7 +4216,7 @@
         <w:t>The +25 % hypothesis is not verified in general</w:t>
       </w:r>
       <w:r>
-        <w:t>, but conditionally: only the highest restoration band produces, in approximately one third of the scenarios, increases that exceed the threshold. The mean variation of that band (11.24 %) falls below the postulated value, which indicates that exceeding the threshold depends on the interaction with the sea-level scenario and the time horizon.</w:t>
+        <w:t>, but conditionally: only the highest restoration band produces, in approximately one third of the scenarios, increases that exceed the threshold. The mean variation of that band (11.24 %) falls below the postulated value, indicating that exceeding the threshold depends on the interaction with the sea-level scenario and the time horizon.</w:t>
       </w:r>
     </w:p>
     <w:p>
@@ -4227,17 +4229,7 @@
     </w:p>
     <w:p>
       <w:r>
-        <w:t>The tree ensembles reproduced the deterministic engine with practically exact fidelity. The Extra Trees model reached a coefficient of determination of 1.000 with a mean absolute error of 0.014 percentage points. This level of precision is characteristic of emulators trained on the output of a deterministic model: the response surface is smooth, free of measurement noise and fully observable.</w:t>
-      </w:r>
-    </w:p>
-    <w:p>
-      <w:r>
-        <w:t>The literature on emulation of physical models allows situating this result. Jiang et al. (2021) obtained speed-ups of up to forty-five times relative to the reference numerical model via physics-informed neural operators, maintaining precision in the prediction of sea surface height [6]. The difference in approach is revealing: while there the objective was to replace a high-computational-cost hydrodynamic model while preserving its fidelity, here the emulator fulfils a different function —enabling exhaustive exploration of the scenario space and feeding an interactive interface.</w:t>
-      </w:r>
-    </w:p>
-    <w:p>
-      <w:r>
-        <w:t>That distinction also explains the performance gap relative to the linear models. Yang et al. (2024) warn that many physics-informed approaches restrict their scope to the use of sparse guide data, inefficiently exploiting the available simulation results [24]. In the present case the surface is fully accessible, a condition that favours recursive partitioning methods and that is not verified in applications where direct simulation is prohibitive.</w:t>
+        <w:t>Extra Trees reproduced the deterministic engine with practically exact fidelity (R² = 1.000; MAE = 0.014 percentage points), as expected for an emulator of a smooth, noise-free and fully observable response surface. Jiang et al. (2021) used physics-informed neural operators to accelerate a costly hydrodynamic model while maintaining fidelity [6]. Here, by contrast, the emulator enables exhaustive scenario exploration through an interactive interface. Unlike approaches with sparse guide data [24], the full surface is accessible, favouring recursive partitioning methods.</w:t>
       </w:r>
     </w:p>
     <w:p>
@@ -4264,31 +4256,21 @@
     </w:p>
     <w:p>
       <w:r>
-        <w:t>The most informative finding of the explainability analysis was not which variables turned out to be important, but that the attribution coincided exactly with the algebraic structure of the engine. The sea-level rise scenario and the restoration level dominate the prediction; the baseline variables cancel out in the percentage ratio.</w:t>
+        <w:t>The key explainability finding is that variable attribution coincides with the engine's algebraic structure. Spurious importance for variables with no algebraic effect would have indicated an estimator or partition problem; the observed consistency supports permutation importance as a verification instrument when model opacity hinders direct inspection.</w:t>
       </w:r>
     </w:p>
     <w:p>
       <w:r>
-        <w:t>This coincidence fulfils an audit function. Had permutation importance assigned spurious relevance to variables with no algebraic effect, it would have revealed a problem in the estimator or in the data partition. The observed consistency constitutes an indirect validation of the procedure and supports its use as a verification instrument in systems where the opacity of the model hinders direct inspection.</w:t>
-      </w:r>
-    </w:p>
-    <w:p>
-      <w:r>
-        <w:t xml:space="preserve">The result further illustrates a frequently neglected principle of interpretability: </w:t>
+        <w:t xml:space="preserve">The result further illustrates a frequently neglected principle: </w:t>
       </w:r>
       <w:r>
         <w:rPr>
           <w:b/>
         </w:rPr>
-        <w:t>the distinction between variables relevant to the absolute state of the system and variables relevant to its relative change</w:t>
-      </w:r>
-      <w:r>
-        <w:t>. Area and carbon density determine the total stock —decisive information for the economic valorisation of the ecosystem [10]— but are irrelevant to the modelled percentage variation. Zia et al. (2025) warn that operational datasets commonly present missing values due to sensor failures and adverse weather conditions [25]; a model that discards variables for their null contribution to a specific metric may be discarding precisely those that sustain other dimensions of the decision.</w:t>
-      </w:r>
-    </w:p>
-    <w:p>
-      <w:r>
-        <w:t>Durden (2025) insists that the development of environmental digital twins must focus on outcomes meaningful to user needs and not on isolated technical capabilities [17]. The foregoing distinction is a concrete application of that principle: a Sanctuary manager who consults only the percentage variation will obtain no information about the absolute carbon at risk, and vice versa. The developed dashboard exposes both dimensions explicitly to avoid that partial reading.</w:t>
+        <w:t>the distinction between variables relevant to the system's absolute state and variables relevant to its relative change</w:t>
+      </w:r>
+      <w:r>
+        <w:t>. Area and carbon density determine the total stock —decisive for economic valorisation [10]— but are irrelevant to the modelled percentage variation. Zia et al. (2025) warn that operational datasets commonly present missing values [25]; a model discarding variables for their null contribution to one metric may discard those sustaining other decision dimensions. Per Durden (2025)'s insistence that development focus on outcomes meaningful to users [17], the dashboard exposes both dimensions explicitly.</w:t>
       </w:r>
     </w:p>
     <w:p>
@@ -4301,22 +4283,17 @@
     </w:p>
     <w:p>
       <w:r>
-        <w:t>The hypothesis contrast yielded a more nuanced result than the initial postulate. The claim that hydrological restoration can increase carbon retention by at least 25 % by 2050 is not sustained in general, but conditionally in the highest intervention band and with an approximate probability of one third.</w:t>
+        <w:t>The hypothesis contrast yielded a more nuanced result than the initial postulate: the claim that hydrological restoration can increase carbon retention by at least 25 % by 2050 is sustained not in general, but conditionally in the highest intervention band and with an approximate probability of one third.</w:t>
       </w:r>
     </w:p>
     <w:p>
       <w:r>
-        <w:t>This result dialogues directly with the literature on coastal wetland restoration. Twomey et al. (2024) note that guidance for hydrological restoration remains limited and is frequently focused on particular regions, activities or risks [10], which suggests that aspirational thresholds of general scope are difficult to sustain on the available evidence. The same authors document that ecosystem functions influenced by the hydrological regime determine services such as carbon capture and coastal protection, but that this relationship is not uniform across sites [10].</w:t>
+        <w:t>This dialogues directly with the coastal wetland restoration literature. Twomey et al. (2024) note that hydrological-restoration guidance remains limited and region-specific [10], suggesting that general aspirational thresholds are difficult to sustain on available evidence, and that the underlying function-service relationships are non-uniform across sites [10]. Buffington et al. (2021) provide convergent evidence that salinity scenarios and productivity functions determine carbon-capture projections under sea-level rise [15]; the present work reproduces that pattern — exceeding the threshold depends on the interaction between restoration level, sea-level rise scenario and time horizon.</w:t>
       </w:r>
     </w:p>
     <w:p>
       <w:r>
-        <w:t>Buffington et al. (2021) provide convergent evidence by demonstrating that both salinity scenarios and productivity functions are determinant in projecting how carbon capture may change under sea-level rise [15]. The present work reproduces that pattern: exceeding the threshold depends on the interaction between restoration level, sea-level rise scenario and time horizon.</w:t>
-      </w:r>
-    </w:p>
-    <w:p>
-      <w:r>
-        <w:t>The operative reading of the finding deserves emphasis. The intermediate restoration bands, far from being ineffective, produce the transition from net loss to net gain —from −17.64 % to −1.92 %—, which represents a substantial benefit even though it does not reach the aspirational threshold. Lu et al. (2026) stress that the state and dynamics of the ecosystem under future scenarios are essential for stakeholders to carry out proactive management oriented towards conserving the ecosystem and supporting its restoration [9]; an instrument that quantifies that transition serves that purpose even if its result does not confirm the initial hypothesis.</w:t>
+        <w:t>The intermediate bands are not ineffective: they produce a transition from net loss to net gain (−17.64 % to −1.92 %), a substantial benefit below the aspirational threshold. Quantifying this transition supports the proactive management of future ecosystem dynamics [9].</w:t>
       </w:r>
     </w:p>
     <w:p>
@@ -4329,17 +4306,12 @@
     </w:p>
     <w:p>
       <w:r>
-        <w:t>The explicit separation between the empirical and the simulated portions of the dataset responds to a requirement that the literature formulates clearly. De Koning et al. (2023) warn that the concept of the digital twin in ecology must be accompanied by a frank discussion of its inherent limitations, so as not to generate expectations that mislead modellers, researchers, policy-makers and resource managers [5]. Tzachor et al. (2023) extend the warning to the oceanic domain, anticipating ethical concerns and uncertainties in the digital representation of marine ecosystem services [7]. Declaring which part of the result rests on observation and which part on projection is a direct response to that requirement.</w:t>
+        <w:t>Separating empirical from simulated data responds to calls for frank discussion of digital-twin limitations [5, 7]. The 39 version-control commits link quality findings to their corrections, supporting reproducibility where convergence between data infrastructures remains unresolved [29].</w:t>
       </w:r>
     </w:p>
     <w:p>
       <w:r>
-        <w:t>Version control discipline sustained the traceability of the artefact. The 39 recorded commits document not only the incorporation of functionality, but the complete review cycle: every detected quality finding was associated with a commit recording its correction. Jeffery et al. (2021) argue that convergence between data infrastructures is not yet resolved [29]; the systematic record of changes constitutes a modest but effective contribution to reproducibility in a context where such mechanisms are scarce.</w:t>
-      </w:r>
-    </w:p>
-    <w:p>
-      <w:r>
-        <w:t>Regarding governance, Haraguchi et al. (2024) examine the specific areas where urban digital twins are effective and those where their impact is bounded [32], while Hananto and Veza (2025) propose aligning standards and practices through explicit governance frameworks [33]. DeVries (2024) identifies the privacy and data sovereignty challenges that emerge from these technologies [34], and Garske et al. (2024) analyse the role of data governance in the sustainable transition [35]. The present work does not address these dimensions, which constitutes a limitation relative to the state of the art in the matter.</w:t>
+        <w:t>On governance, Haraguchi et al. (2024) examine where urban digital twins are effective [32], Hananto and Veza (2025) propose explicit governance frameworks [33], DeVries (2024) identifies privacy and data-sovereignty challenges [34], and Garske et al. (2024) analyse data governance in the sustainable transition [35]. The present work does not address these dimensions — a limitation relative to the state of the art.</w:t>
       </w:r>
     </w:p>
     <w:p>
@@ -4352,17 +4324,7 @@
     </w:p>
     <w:p>
       <w:r>
-        <w:t>It is worth contrasting the case presented here with implementations documented in neighbouring domains. Henriksen et al. (2023) developed a digital twin for climate adaptation and water management, and established that the depth of the water table is the determining variable of carbon emissions in peat soils, with knowledge of hydrological variability being decisive for guiding the restoration of drained peatlands [36]. There is here a conceptual convergence: in both cases the hydrological variable governs the carbon response, although the ecosystems differ.</w:t>
-      </w:r>
-    </w:p>
-    <w:p>
-      <w:r>
-        <w:t>Rodríguez-Alonso et al. (2024) implemented a platform for water treatment plants on a microservices architecture, oriented towards optimising operation and maintenance through machine learning and simulation [37]. Alenezi and Alabaiadly (2026) review the application of digital twins and edge computing to small off-grid water systems [38]. The architecture of the present work is substantially simpler: a monolithic analytical module with an interactive interface, without the separation into services that characterises production platforms. That simplicity is deliberate and responds to the scope of the prototype, but it should be recognised as a difference relative to the architectural state of the art.</w:t>
-      </w:r>
-    </w:p>
-    <w:p>
-      <w:r>
-        <w:t>On the data plane, Aguzzi et al. (2025) demonstrate that robotic platforms generate high-resolution marine data, but note that challenges of spatial coverage, temporal continuity and ecological representativeness persist [8]. The present work depends on open satellite data and published literature, which guarantees extensive temporal coverage but limits spatial resolution to the site scale and restricts updating to the frequency of the available series.</w:t>
+        <w:t>Related applications also link hydrology and carbon: water-table depth determines peat-soil emissions [36]. Other water-system digital twins use microservices or edge architectures [37, 38], whereas this prototype deliberately uses a simpler monolithic analytical module. Robotic platforms can provide high-resolution marine data but face coverage and representativeness challenges [8]; open satellite data offer temporal coverage here, but limit spatial resolution and update frequency.</w:t>
       </w:r>
     </w:p>
     <w:p>
@@ -4375,7 +4337,7 @@
     </w:p>
     <w:p>
       <w:r>
-        <w:t>The present work presents five limitations that must be considered when interpreting its results.</w:t>
+        <w:t>Five limitations must be considered when interpreting these results.</w:t>
       </w:r>
     </w:p>
     <w:p>
@@ -4389,7 +4351,7 @@
         <w:t>the target variable is simulated</w:t>
       </w:r>
       <w:r>
-        <w:t>. Although the covariates come from published literature and the structure of the engine is coherent with the available evidence, the performance metrics quantify the fidelity of the emulator relative to the engine, not the predictive capacity over field observations. Twomey et al. (2024) warn that hydrological restoration models may not be transferable to other sites and that their predictive capacity is restricted to the specific conditions of the data used in their construction [10]; that warning applies in full here.</w:t>
+        <w:t>. Although the covariables come from published literature and the engine's structure is coherent with available evidence, the performance metrics quantify the emulator's fidelity to the engine, not predictive capacity over field observations. Twomey et al. (2024) warn that hydrological restoration models may not be transferable and that predictive capacity is restricted to the construction data's conditions [10]; that warning applies in full here.</w:t>
       </w:r>
     </w:p>
     <w:p>
@@ -4403,7 +4365,7 @@
         <w:t>absence of spatial structure</w:t>
       </w:r>
       <w:r>
-        <w:t>. The model operates on values aggregated at the site scale, without representing topographic heterogeneity or salinity gradients. Twomey et al. (2024) identify precisely the uncertainty in elevation data as a key limitation of restoration models [10], and Buffington et al. (2021) demonstrate the sensitivity of carbon projections to salinity scenarios [15].</w:t>
+        <w:t>: the model operates on site-scale aggregated values, without representing topographic heterogeneity or salinity gradients — precisely the elevation-uncertainty limitation Twomey et al. (2024) identify as key [10], and Buffington et al. (2021) demonstrate carbon projections' sensitivity to salinity scenarios [15].</w:t>
       </w:r>
     </w:p>
     <w:p>
@@ -4417,7 +4379,7 @@
         <w:t>simplified representation of temporal dynamics</w:t>
       </w:r>
       <w:r>
-        <w:t>, which employs a linear progression between the initial year and the horizon when the real trajectories of accretion and accumulation follow asymptotic patterns.</w:t>
+        <w:t>, a linear progression between initial year and horizon when real accretion and accumulation trajectories follow asymptotic patterns.</w:t>
       </w:r>
     </w:p>
     <w:p>
@@ -4431,7 +4393,7 @@
         <w:t>granularity of the statistical contrast</w:t>
       </w:r>
       <w:r>
-        <w:t>. With ten cross-validation folds, the Wilcoxon test reaches its minimum possible probability value without being able to cross the conventional 0.05 threshold. This limitation is intrinsic to the design and not to the magnitude of the effect; the paired t test, which exploits the magnitude of the differences, reaches significance with p &lt; 0.001 in all comparisons.</w:t>
+        <w:t>: with ten folds, the Wilcoxon test reaches its minimum possible probability without crossing the conventional 0.05 threshold — intrinsic to the design, not to the effect's magnitude; the paired t test, which exploits the differences' magnitude, reaches p &lt; 0.001 in all comparisons.</w:t>
       </w:r>
     </w:p>
     <w:p>
@@ -4445,7 +4407,7 @@
         <w:t>absence of stakeholder participation</w:t>
       </w:r>
       <w:r>
-        <w:t>. Durden (2025) stresses that the incorporation of stakeholders broadens the capacity for collaborative decision-making [17], and DeVries (2024) highlights the governance challenges that emerge from these technologies [34]. The present work defines its success criteria without consulting the Sanctuary's managers, which constitutes a gap relative to the recommendations of the state of the art.</w:t>
+        <w:t>. Durden (2025) stresses that stakeholder incorporation broadens collaborative decision capacity [17], and DeVries (2024) highlights the governance challenges of these technologies [34]. The present work defines its success criteria without consulting the Sanctuary's managers — a gap relative to state-of-the-art recommendations.</w:t>
       </w:r>
     </w:p>
     <w:p>
@@ -4458,12 +4420,7 @@
     </w:p>
     <w:p>
       <w:r>
-        <w:t>Four lines of continuity derive from these limitations. The incorporation of field measurements from the SNLMT would allow recalibrating the engine and validating the projections against independent observations, heeding the transferability requirement noted by Twomey et al. (2024) [10]. The integration of raster layers of cover and elevation would enable the representation of spatial heterogeneity and the exploration of scenarios differentiated by band, responding to the limitation identified by Buffington et al. (2021) regarding salinity [15].</w:t>
-      </w:r>
-    </w:p>
-    <w:p>
-      <w:r>
-        <w:t>On the architectural plane, migration towards a services architecture —following the patterns documented by Picone et al. (2023) for edge deployments [20] and by Rodríguez-Alonso et al. (2024) for water platforms [37]— would allow scaling the system and facilitating its interoperability with other data infrastructures. Finally, the incorporation of a structured stakeholder participation process, in line with the recommendations of Durden (2025) [17] and the governance frameworks of Hananto and Veza (2025) [33], would allow aligning the system's success criteria with the effective needs of the Sanctuary's managers.</w:t>
+        <w:t>Four lines of continuity derive from these limitations. Incorporating SNLMT field measurements would allow recalibrating the engine and validating projections against independent observations, heeding the transferability requirement [10]. Integrating cover and elevation raster layers would enable representing spatial heterogeneity and band-differentiated scenarios, responding to the salinity limitation [15]. On architecture, migration towards services —following Picone et al. (2023) for edge deployments [20] and Rodríguez-Alonso et al. (2024) for water platforms [37]— would allow scaling and interoperability. Finally, a structured stakeholder participation process, per Durden (2025) [17] and Hananto and Veza (2025) [33], would align the system's success criteria with the Sanctuary managers' effective needs.</w:t>
       </w:r>
     </w:p>
     <w:p>
@@ -4476,7 +4433,7 @@
     </w:p>
     <w:p>
       <w:r>
-        <w:t>The present work developed a digital twin of the Los Manglares de Tumbes National Sanctuary and applied the CRISP-DM methodology to model, explain and communicate the variation of blue carbon under hydrological restoration and sea-level rise scenarios through 2050. The conclusions are organised around the four success criteria defined in the business understanding phase.</w:t>
+        <w:t>This work developed a digital twin of the Los Manglares de Tumbes National Sanctuary and applied CRISP-DM to model, explain and communicate blue carbon variation under hydrological restoration and sea-level rise scenarios through 2050. Conclusions follow the four business-phase success criteria.</w:t>
       </w:r>
     </w:p>
     <w:p>
@@ -4498,7 +4455,7 @@
         <w:t>Statistical superiority.</w:t>
       </w:r>
       <w:r>
-        <w:t xml:space="preserve"> The criterion of significant difference from the reference linear model was met in all comparisons. The paired t test yielded p &lt; 0.001 against the linear models (t = 25.91) and against the remaining ensembles (t between 5.23 and 7.49). The non-parametric Wilcoxon test converges in the same direction, and the verification of non-normality of the residuals (Shapiro-Wilk, p &lt; 0.001) justifies its inclusion as a complementary contrast.</w:t>
+        <w:t xml:space="preserve"> The criterion of significant difference from the reference linear model was met in all comparisons: the paired t test yielded p &lt; 0.001 against the linear models (t = 25.91) and against the remaining ensembles (t between 5.23 and 7.49); the Wilcoxon test converges in the same direction, and the verified non-normality of the residuals (Shapiro-Wilk, p &lt; 0.001) justifies its inclusion.</w:t>
       </w:r>
     </w:p>
     <w:p>
@@ -4534,22 +4491,22 @@
     </w:p>
     <w:p>
       <w:r>
-        <w:t>These findings must be interpreted in the light of the study's main limitation: the target variable is simulated. The conclusions describe the fidelity of the emulator relative to the deterministic engine and the internal coherence of the physical model, not the predictive capacity over field observations. The substitution of the calibrated parameters by measurements from the SNLMT —currently under way through the region's blue carbon certification process [9]— constitutes the necessary step to confer empirical validity on the projections.</w:t>
+        <w:t>These findings must be interpreted in light of the study's main limitation: the target variable is simulated. The conclusions describe the emulator's fidelity to the deterministic engine and the physical model's internal coherence, not predictive capacity over field observations. Substituting the calibrated parameters with SNLMT measurements —currently under way through the region's blue carbon certification process [9]— is the necessary step to confer empirical validity on the projections.</w:t>
       </w:r>
     </w:p>
     <w:p>
       <w:r>
-        <w:t>Beyond the numerical results, the work contributes three reusable products: a hybrid dataset anchored in published real data with explicit traceability of its components; an analytical module that implements the six phases of CRISP-DM in a reproducible and verifiable manner; and an interactive dashboard that exposes interpretability as a first-class capability, allowing non-specialised managers to interrogate the model and understand the contribution of each variable to the prediction.</w:t>
+        <w:t>Beyond the numerical results, the work contributes three reusable products: a hybrid dataset anchored in published real data with explicit component traceability; an analytical module implementing the six CRISP-DM phases reproducibly and verifiably; and an interactive dashboard exposing interpretability as a first-class capability, allowing non-specialised managers to interrogate the model and understand each variable's contribution.</w:t>
       </w:r>
     </w:p>
     <w:p>
       <w:r>
-        <w:t>The practical relevance of the approach lies in its capacity to sustain management decisions with quantified and communicable evidence. An instrument that makes it possible to estimate the restoration level required to transition from net loss to net carbon gain, and that makes explicit the dependence of that response on the climate scenario, has direct value for conservation planning, investment prioritisation and the technical substantiation of blue carbon certification processes.</w:t>
+        <w:t>The approach sustains management decisions with quantified evidence: an instrument that estimates the restoration level required to transition from net loss to net carbon gain, and makes explicit that response's dependence on the climate scenario, has direct value for conservation planning, investment prioritisation and the technical substantiation of blue carbon certification.</w:t>
       </w:r>
     </w:p>
     <w:p>
       <w:r>
-        <w:t>Finally, the version control discipline sustained throughout development —39 commits with descriptive messages linking each change to the finding that motivated it— constitutes a methodological contribution in itself: it guarantees that any reported result is traceable to the exact state of the code that produced it, an indispensable condition for the reproducibility of computational research.</w:t>
+        <w:t>Finally, version control —39 commits linking changes to motivating findings— makes each result traceable to its code state, an essential condition for reproducible computational research.</w:t>
       </w:r>
     </w:p>
     <w:p>

</xml_diff>